<commit_message>
ready to collect content by owner
</commit_message>
<xml_diff>
--- a/owner-content/01-home/EDIT-IN-GOOGLE-DRIVE.docx
+++ b/owner-content/01-home/EDIT-IN-GOOGLE-DRIVE.docx
@@ -2,7 +2,7 @@
 <file path=word/document.xml><?xml version="1.0" encoding="utf-8"?>
 <w:document xmlns:w="http://schemas.openxmlformats.org/wordprocessingml/2006/main" xmlns:m="http://schemas.openxmlformats.org/officeDocument/2006/math" xmlns:r="http://schemas.openxmlformats.org/officeDocument/2006/relationships" xmlns:o="urn:schemas-microsoft-com:office:office" xmlns:v="urn:schemas-microsoft-com:vml" xmlns:w10="urn:schemas-microsoft-com:office:word" xmlns:a="http://schemas.openxmlformats.org/drawingml/2006/main" xmlns:pic="http://schemas.openxmlformats.org/drawingml/2006/picture" xmlns:wp="http://schemas.openxmlformats.org/drawingml/2006/wordprocessingDrawing">
   <w:body>
-    <w:bookmarkStart w:id="14" w:name="home-page-your-answers"/>
+    <w:bookmarkStart w:id="13" w:name="home-page-your-answers"/>
     <w:p>
       <w:pPr>
         <w:pStyle w:val="Heading1"/>
@@ -123,33 +123,7 @@
       </w:r>
     </w:p>
     <w:bookmarkEnd w:id="12"/>
-    <w:bookmarkStart w:id="13" w:name="X8bd59e2bcf864ea5bd26223bfe4e69700e08520"/>
-    <w:p>
-      <w:pPr>
-        <w:pStyle w:val="Heading3"/>
-      </w:pPr>
-      <w:r>
-        <w:t xml:space="preserve">5. Is the doctor in the current stand-in photo Dr. Tanay S Parikh, and may it remain visible until a new photo is approved?</w:t>
-      </w:r>
-    </w:p>
-    <w:p>
-      <w:pPr>
-        <w:pStyle w:val="BlockText"/>
-      </w:pPr>
-      <w:r>
-        <w:t xml:space="preserve">Currently: Used only as a temporary stand-in where allowed.</w:t>
-      </w:r>
-    </w:p>
-    <w:p>
-      <w:pPr>
-        <w:pStyle w:val="FirstParagraph"/>
-      </w:pPr>
-      <w:r>
-        <w:t xml:space="preserve">Your answer:</w:t>
-      </w:r>
-    </w:p>
     <w:bookmarkEnd w:id="13"/>
-    <w:bookmarkEnd w:id="14"/>
     <w:sectPr>
       <w:footnotePr>
         <w:numRestart w:val="eachSect"/>

</xml_diff>